<commit_message>
Good chunk of proposal done
</commit_message>
<xml_diff>
--- a/GAM708 Proposal Form.docx
+++ b/GAM708 Proposal Form.docx
@@ -673,7 +673,7 @@
               <w:spacing w:before="60" w:after="60"/>
             </w:pPr>
             <w:r>
-              <w:t>How to use game design to work against the player??</w:t>
+              <w:t xml:space="preserve">Environmental Guidance in Digital Games: Influencing Player Navigation Without Explicit Instruction </w:t>
             </w:r>
           </w:p>
         </w:tc>
@@ -756,49 +756,10 @@
           </w:tcPr>
           <w:p>
             <w:pPr>
-              <w:spacing w:before="60" w:after="60"/>
-              <w:rPr>
-                <w:color w:val="auto"/>
-                <w:sz w:val="18"/>
-                <w:szCs w:val="18"/>
-              </w:rPr>
-            </w:pPr>
-            <w:r>
-              <w:rPr>
-                <w:color w:val="auto"/>
-                <w:sz w:val="18"/>
-                <w:szCs w:val="18"/>
-              </w:rPr>
-              <w:t>How to use game design to work against the player without it frustrating the player too much to where its unenjoyable but enough to add challenge and be fun. – Need to word this way better</w:t>
-            </w:r>
-          </w:p>
-          <w:p>
-            <w:pPr>
-              <w:spacing w:before="60" w:after="60"/>
-            </w:pPr>
-          </w:p>
-          <w:p>
-            <w:pPr>
               <w:spacing w:after="200"/>
             </w:pPr>
             <w:r>
-              <w:t xml:space="preserve"> </w:t>
-            </w:r>
-          </w:p>
-          <w:p>
-            <w:pPr>
-              <w:spacing w:after="200"/>
-            </w:pPr>
-            <w:r>
-              <w:t xml:space="preserve"> </w:t>
-            </w:r>
-          </w:p>
-          <w:p>
-            <w:pPr>
-              <w:spacing w:after="200"/>
-            </w:pPr>
-            <w:r>
-              <w:t xml:space="preserve"> </w:t>
+              <w:t>Which environmental design techniques are most effective at influencing player navigation and decision making without explicit guidance systems?</w:t>
             </w:r>
           </w:p>
         </w:tc>
@@ -966,7 +927,6 @@
                 <w:sz w:val="18"/>
                 <w:szCs w:val="18"/>
               </w:rPr>
-              <w:lastRenderedPageBreak/>
               <w:t>Artefact description and intended audience</w:t>
             </w:r>
           </w:p>
@@ -1015,6 +975,7 @@
               <w:spacing w:after="200"/>
             </w:pPr>
             <w:r>
+              <w:lastRenderedPageBreak/>
               <w:t xml:space="preserve"> </w:t>
             </w:r>
           </w:p>
@@ -1151,21 +1112,24 @@
             <w:pPr>
               <w:spacing w:after="200"/>
             </w:pPr>
+            <w:r>
+              <w:t xml:space="preserve">Player guidance is a fundamental aspect of game design, as designers must communicate objectives and direct players through virtual environments. Traditional methods of guidance often rely on explicit systems such as quest markers, </w:t>
+            </w:r>
+            <w:proofErr w:type="spellStart"/>
+            <w:r>
+              <w:t>minimaps</w:t>
+            </w:r>
+            <w:proofErr w:type="spellEnd"/>
+            <w:r>
+              <w:t>, objective indicators, and tutorial prompts. While effective, these systems can reduce immersion and limit opportunities for player driven discovery.</w:t>
+            </w:r>
           </w:p>
           <w:p>
             <w:pPr>
               <w:spacing w:after="200"/>
             </w:pPr>
             <w:r>
-              <w:t xml:space="preserve"> </w:t>
-            </w:r>
-          </w:p>
-          <w:p>
-            <w:pPr>
-              <w:spacing w:after="200"/>
-            </w:pPr>
-            <w:r>
-              <w:t xml:space="preserve"> </w:t>
+              <w:t>This project will build upon existing research and industry practices by investigating which environmental design techniques are most effective at influencing player navigation and decision making without explicit guidance systems. The findings aim to contribute practical recommendations for game designers seeking to create more immersive and intuitive player experiences.</w:t>
             </w:r>
           </w:p>
         </w:tc>
@@ -1271,15 +1235,80 @@
           <w:p>
             <w:pPr>
               <w:spacing w:before="60" w:after="60"/>
-            </w:pPr>
-            <w:r>
-              <w:t>An architectural approach to level design book</w:t>
+              <w:rPr>
+                <w:b/>
+                <w:bCs/>
+                <w:u w:val="single"/>
+              </w:rPr>
+            </w:pPr>
+            <w:r>
+              <w:rPr>
+                <w:b/>
+                <w:bCs/>
+                <w:u w:val="single"/>
+              </w:rPr>
+              <w:t>Books</w:t>
             </w:r>
           </w:p>
           <w:p>
             <w:pPr>
               <w:spacing w:before="60" w:after="60"/>
             </w:pPr>
+            <w:hyperlink r:id="rId7" w:history="1">
+              <w:r>
+                <w:rPr>
+                  <w:rStyle w:val="Hyperlink"/>
+                </w:rPr>
+                <w:t>An architectural approach to level design</w:t>
+              </w:r>
+            </w:hyperlink>
+            <w:r>
+              <w:t xml:space="preserve"> </w:t>
+            </w:r>
+          </w:p>
+          <w:p>
+            <w:pPr>
+              <w:spacing w:before="60" w:after="60"/>
+            </w:pPr>
+            <w:r>
+              <w:t xml:space="preserve">The Art of Game Design </w:t>
+            </w:r>
+          </w:p>
+          <w:p>
+            <w:pPr>
+              <w:spacing w:before="60" w:after="60"/>
+            </w:pPr>
+            <w:r>
+              <w:t>Rules of Play</w:t>
+            </w:r>
+          </w:p>
+          <w:p>
+            <w:pPr>
+              <w:spacing w:before="60" w:after="60"/>
+            </w:pPr>
+          </w:p>
+          <w:p>
+            <w:pPr>
+              <w:spacing w:before="60" w:after="60"/>
+              <w:rPr>
+                <w:b/>
+                <w:bCs/>
+                <w:u w:val="single"/>
+              </w:rPr>
+            </w:pPr>
+            <w:r>
+              <w:rPr>
+                <w:b/>
+                <w:bCs/>
+                <w:u w:val="single"/>
+              </w:rPr>
+              <w:t>Videos</w:t>
+            </w:r>
+          </w:p>
+          <w:p>
+            <w:pPr>
+              <w:spacing w:before="60" w:after="60"/>
+            </w:pPr>
             <w:r>
               <w:t>Interview with Jason Blundel (Ex Lead designer @Activision)</w:t>
             </w:r>
@@ -1299,7 +1328,77 @@
               <w:spacing w:after="200"/>
             </w:pPr>
             <w:r>
+              <w:rPr>
+                <w:b/>
+                <w:bCs/>
+                <w:u w:val="single"/>
+              </w:rPr>
+              <w:t>Games</w:t>
+            </w:r>
+            <w:r>
+              <w:rPr>
+                <w:b/>
+                <w:bCs/>
+              </w:rPr>
               <w:t xml:space="preserve"> </w:t>
+            </w:r>
+            <w:r>
+              <w:t>(</w:t>
+            </w:r>
+            <w:r>
+              <w:t>All these games use environmental guidance incredibly well without constantly relying on UI markers</w:t>
+            </w:r>
+            <w:r>
+              <w:t>)</w:t>
+            </w:r>
+          </w:p>
+          <w:p>
+            <w:pPr>
+              <w:spacing w:before="60" w:after="60"/>
+              <w:rPr>
+                <w:b/>
+                <w:bCs/>
+                <w:u w:val="single"/>
+              </w:rPr>
+            </w:pPr>
+          </w:p>
+          <w:p>
+            <w:pPr>
+              <w:pStyle w:val="ListParagraph"/>
+              <w:numPr>
+                <w:ilvl w:val="0"/>
+                <w:numId w:val="2"/>
+              </w:numPr>
+              <w:spacing w:after="200"/>
+            </w:pPr>
+            <w:r>
+              <w:t>Portal</w:t>
+            </w:r>
+          </w:p>
+          <w:p>
+            <w:pPr>
+              <w:pStyle w:val="ListParagraph"/>
+              <w:numPr>
+                <w:ilvl w:val="0"/>
+                <w:numId w:val="2"/>
+              </w:numPr>
+              <w:spacing w:after="200"/>
+            </w:pPr>
+            <w:r>
+              <w:t>The Last of Us</w:t>
+            </w:r>
+          </w:p>
+          <w:p>
+            <w:pPr>
+              <w:pStyle w:val="ListParagraph"/>
+              <w:numPr>
+                <w:ilvl w:val="0"/>
+                <w:numId w:val="2"/>
+              </w:numPr>
+              <w:spacing w:after="200"/>
+            </w:pPr>
+            <w:r>
+              <w:t xml:space="preserve">BioShock </w:t>
             </w:r>
           </w:p>
           <w:p>
@@ -1385,6 +1484,7 @@
                 <w:sz w:val="18"/>
                 <w:szCs w:val="18"/>
               </w:rPr>
+              <w:lastRenderedPageBreak/>
               <w:t>Research and development approach</w:t>
             </w:r>
           </w:p>
@@ -1420,7 +1520,29 @@
                 <w:sz w:val="17"/>
                 <w:szCs w:val="17"/>
               </w:rPr>
-              <w:t>How will you investigate your research question? Describe the methods, tools, and processes you will use. Justify your choices in relation to your artefact type and research question.</w:t>
+              <w:t xml:space="preserve">How will you investigate your research question? </w:t>
+            </w:r>
+            <w:proofErr w:type="gramStart"/>
+            <w:r>
+              <w:rPr>
+                <w:i/>
+                <w:iCs/>
+                <w:color w:val="888888"/>
+                <w:sz w:val="17"/>
+                <w:szCs w:val="17"/>
+              </w:rPr>
+              <w:t>Describe</w:t>
+            </w:r>
+            <w:proofErr w:type="gramEnd"/>
+            <w:r>
+              <w:rPr>
+                <w:i/>
+                <w:iCs/>
+                <w:color w:val="888888"/>
+                <w:sz w:val="17"/>
+                <w:szCs w:val="17"/>
+              </w:rPr>
+              <w:t xml:space="preserve"> the methods, tools, and processes you will use. Justify your choices in relation to your artefact type and research question.</w:t>
             </w:r>
           </w:p>
           <w:p>
@@ -1687,7 +1809,29 @@
                 <w:sz w:val="17"/>
                 <w:szCs w:val="17"/>
               </w:rPr>
-              <w:t>Identify any legal, social, ethical, or professional issues associated with your project. If a full ethics application is required, note its current status. If not, briefly explain why no significant ethical risks are present.</w:t>
+              <w:t xml:space="preserve">Identify any legal, social, ethical, or professional issues associated with your project. If a full ethics application is required, note its </w:t>
+            </w:r>
+            <w:proofErr w:type="gramStart"/>
+            <w:r>
+              <w:rPr>
+                <w:i/>
+                <w:iCs/>
+                <w:color w:val="888888"/>
+                <w:sz w:val="17"/>
+                <w:szCs w:val="17"/>
+              </w:rPr>
+              <w:t>current status</w:t>
+            </w:r>
+            <w:proofErr w:type="gramEnd"/>
+            <w:r>
+              <w:rPr>
+                <w:i/>
+                <w:iCs/>
+                <w:color w:val="888888"/>
+                <w:sz w:val="17"/>
+                <w:szCs w:val="17"/>
+              </w:rPr>
+              <w:t>. If not, briefly explain why no significant ethical risks are present.</w:t>
             </w:r>
           </w:p>
           <w:p>
@@ -1904,14 +2048,32 @@
           <w:p>
             <w:pPr>
               <w:jc w:val="center"/>
-            </w:pPr>
-            <w:r>
               <w:rPr>
                 <w:color w:val="666666"/>
                 <w:sz w:val="18"/>
                 <w:szCs w:val="18"/>
               </w:rPr>
+            </w:pPr>
+            <w:r>
+              <w:rPr>
+                <w:color w:val="666666"/>
+                <w:sz w:val="18"/>
+                <w:szCs w:val="18"/>
+              </w:rPr>
               <w:t>Week 2</w:t>
+            </w:r>
+          </w:p>
+          <w:p>
+            <w:pPr>
+              <w:jc w:val="center"/>
+            </w:pPr>
+            <w:r>
+              <w:rPr>
+                <w:color w:val="666666"/>
+                <w:sz w:val="18"/>
+                <w:szCs w:val="18"/>
+              </w:rPr>
+              <w:t>8.06.2026</w:t>
             </w:r>
           </w:p>
         </w:tc>
@@ -1937,7 +2099,10 @@
               <w:spacing w:after="160"/>
             </w:pPr>
             <w:r>
-              <w:t xml:space="preserve"> </w:t>
+              <w:t xml:space="preserve">Complete literature review and identify key theories and resources I will use. Finalise research question </w:t>
+            </w:r>
+            <w:r>
+              <w:t>and proposal form</w:t>
             </w:r>
           </w:p>
         </w:tc>
@@ -1990,14 +2155,45 @@
           <w:p>
             <w:pPr>
               <w:jc w:val="center"/>
-            </w:pPr>
-            <w:r>
               <w:rPr>
                 <w:color w:val="666666"/>
                 <w:sz w:val="18"/>
                 <w:szCs w:val="18"/>
               </w:rPr>
-              <w:t>Week 4</w:t>
+            </w:pPr>
+            <w:r>
+              <w:rPr>
+                <w:color w:val="666666"/>
+                <w:sz w:val="18"/>
+                <w:szCs w:val="18"/>
+              </w:rPr>
+              <w:t xml:space="preserve">Week </w:t>
+            </w:r>
+            <w:r>
+              <w:rPr>
+                <w:color w:val="666666"/>
+                <w:sz w:val="18"/>
+                <w:szCs w:val="18"/>
+              </w:rPr>
+              <w:t>3</w:t>
+            </w:r>
+          </w:p>
+          <w:p>
+            <w:pPr>
+              <w:jc w:val="center"/>
+              <w:rPr>
+                <w:color w:val="666666"/>
+                <w:sz w:val="18"/>
+                <w:szCs w:val="18"/>
+              </w:rPr>
+            </w:pPr>
+            <w:r>
+              <w:rPr>
+                <w:color w:val="666666"/>
+                <w:sz w:val="18"/>
+                <w:szCs w:val="18"/>
+              </w:rPr>
+              <w:t>Proposal due 24.06</w:t>
             </w:r>
           </w:p>
         </w:tc>
@@ -2023,7 +2219,7 @@
               <w:spacing w:after="160"/>
             </w:pPr>
             <w:r>
-              <w:t xml:space="preserve"> </w:t>
+              <w:t xml:space="preserve"> Polish and submit proposal.</w:t>
             </w:r>
           </w:p>
         </w:tc>
@@ -2076,14 +2272,41 @@
           <w:p>
             <w:pPr>
               <w:jc w:val="center"/>
-            </w:pPr>
-            <w:r>
               <w:rPr>
                 <w:color w:val="666666"/>
                 <w:sz w:val="18"/>
                 <w:szCs w:val="18"/>
               </w:rPr>
-              <w:t>Week 6</w:t>
+            </w:pPr>
+            <w:r>
+              <w:rPr>
+                <w:color w:val="666666"/>
+                <w:sz w:val="18"/>
+                <w:szCs w:val="18"/>
+              </w:rPr>
+              <w:lastRenderedPageBreak/>
+              <w:t>Week 4</w:t>
+            </w:r>
+          </w:p>
+          <w:p>
+            <w:pPr>
+              <w:jc w:val="center"/>
+            </w:pPr>
+            <w:r>
+              <w:rPr>
+                <w:color w:val="666666"/>
+                <w:sz w:val="18"/>
+                <w:szCs w:val="18"/>
+              </w:rPr>
+              <w:t>29</w:t>
+            </w:r>
+            <w:r>
+              <w:rPr>
+                <w:color w:val="666666"/>
+                <w:sz w:val="18"/>
+                <w:szCs w:val="18"/>
+              </w:rPr>
+              <w:t>.06.2026</w:t>
             </w:r>
           </w:p>
         </w:tc>
@@ -2109,7 +2332,7 @@
               <w:spacing w:after="160"/>
             </w:pPr>
             <w:r>
-              <w:t xml:space="preserve"> </w:t>
+              <w:t>Analyse case study games and document examples of environmental guidance techniques. Produce initial design concepts for prototypes.</w:t>
             </w:r>
           </w:p>
         </w:tc>
@@ -2162,14 +2385,61 @@
           <w:p>
             <w:pPr>
               <w:jc w:val="center"/>
-            </w:pPr>
-            <w:r>
               <w:rPr>
                 <w:color w:val="666666"/>
                 <w:sz w:val="18"/>
                 <w:szCs w:val="18"/>
               </w:rPr>
-              <w:t>Week 8</w:t>
+            </w:pPr>
+            <w:r>
+              <w:rPr>
+                <w:color w:val="666666"/>
+                <w:sz w:val="18"/>
+                <w:szCs w:val="18"/>
+              </w:rPr>
+              <w:t>Week 5</w:t>
+            </w:r>
+          </w:p>
+          <w:p>
+            <w:pPr>
+              <w:jc w:val="center"/>
+              <w:rPr>
+                <w:color w:val="666666"/>
+                <w:sz w:val="18"/>
+                <w:szCs w:val="18"/>
+              </w:rPr>
+            </w:pPr>
+            <w:r>
+              <w:rPr>
+                <w:color w:val="666666"/>
+                <w:sz w:val="18"/>
+                <w:szCs w:val="18"/>
+              </w:rPr>
+              <w:t>6</w:t>
+            </w:r>
+            <w:r>
+              <w:rPr>
+                <w:color w:val="666666"/>
+                <w:sz w:val="18"/>
+                <w:szCs w:val="18"/>
+              </w:rPr>
+              <w:t>.0</w:t>
+            </w:r>
+            <w:r>
+              <w:rPr>
+                <w:color w:val="666666"/>
+                <w:sz w:val="18"/>
+                <w:szCs w:val="18"/>
+              </w:rPr>
+              <w:t>7</w:t>
+            </w:r>
+            <w:r>
+              <w:rPr>
+                <w:color w:val="666666"/>
+                <w:sz w:val="18"/>
+                <w:szCs w:val="18"/>
+              </w:rPr>
+              <w:t>.2026</w:t>
             </w:r>
           </w:p>
         </w:tc>
@@ -2194,9 +2464,6 @@
             <w:pPr>
               <w:spacing w:after="160"/>
             </w:pPr>
-            <w:r>
-              <w:t xml:space="preserve"> </w:t>
-            </w:r>
           </w:p>
         </w:tc>
         <w:tc>
@@ -2220,9 +2487,6 @@
             <w:pPr>
               <w:spacing w:after="160"/>
             </w:pPr>
-            <w:r>
-              <w:t xml:space="preserve"> </w:t>
-            </w:r>
           </w:p>
         </w:tc>
       </w:tr>
@@ -2248,14 +2512,40 @@
           <w:p>
             <w:pPr>
               <w:jc w:val="center"/>
-            </w:pPr>
-            <w:r>
               <w:rPr>
                 <w:color w:val="666666"/>
                 <w:sz w:val="18"/>
                 <w:szCs w:val="18"/>
               </w:rPr>
-              <w:t>Week 10</w:t>
+            </w:pPr>
+            <w:r>
+              <w:rPr>
+                <w:color w:val="666666"/>
+                <w:sz w:val="18"/>
+                <w:szCs w:val="18"/>
+              </w:rPr>
+              <w:t>Week 6</w:t>
+            </w:r>
+          </w:p>
+          <w:p>
+            <w:pPr>
+              <w:jc w:val="center"/>
+            </w:pPr>
+            <w:r>
+              <w:rPr>
+                <w:color w:val="666666"/>
+                <w:sz w:val="18"/>
+                <w:szCs w:val="18"/>
+              </w:rPr>
+              <w:t>13</w:t>
+            </w:r>
+            <w:r>
+              <w:rPr>
+                <w:color w:val="666666"/>
+                <w:sz w:val="18"/>
+                <w:szCs w:val="18"/>
+              </w:rPr>
+              <w:t>.07.2026</w:t>
             </w:r>
           </w:p>
         </w:tc>
@@ -2281,7 +2571,13 @@
               <w:spacing w:after="160"/>
             </w:pPr>
             <w:r>
-              <w:t xml:space="preserve"> </w:t>
+              <w:t>Prototype 1</w:t>
+            </w:r>
+            <w:r>
+              <w:t>:</w:t>
+            </w:r>
+            <w:r>
+              <w:t xml:space="preserve"> Lighting Guidance </w:t>
             </w:r>
           </w:p>
         </w:tc>
@@ -2334,14 +2630,53 @@
           <w:p>
             <w:pPr>
               <w:jc w:val="center"/>
-            </w:pPr>
-            <w:r>
               <w:rPr>
                 <w:color w:val="666666"/>
                 <w:sz w:val="18"/>
                 <w:szCs w:val="18"/>
               </w:rPr>
-              <w:t>Week 12</w:t>
+            </w:pPr>
+            <w:r>
+              <w:rPr>
+                <w:color w:val="666666"/>
+                <w:sz w:val="18"/>
+                <w:szCs w:val="18"/>
+              </w:rPr>
+              <w:t xml:space="preserve">Week </w:t>
+            </w:r>
+            <w:r>
+              <w:rPr>
+                <w:color w:val="666666"/>
+                <w:sz w:val="18"/>
+                <w:szCs w:val="18"/>
+              </w:rPr>
+              <w:t>7</w:t>
+            </w:r>
+          </w:p>
+          <w:p>
+            <w:pPr>
+              <w:jc w:val="center"/>
+              <w:rPr>
+                <w:color w:val="666666"/>
+                <w:sz w:val="18"/>
+                <w:szCs w:val="18"/>
+              </w:rPr>
+            </w:pPr>
+            <w:r>
+              <w:rPr>
+                <w:color w:val="666666"/>
+                <w:sz w:val="18"/>
+                <w:szCs w:val="18"/>
+              </w:rPr>
+              <w:t>20</w:t>
+            </w:r>
+            <w:r>
+              <w:rPr>
+                <w:color w:val="666666"/>
+                <w:sz w:val="18"/>
+                <w:szCs w:val="18"/>
+              </w:rPr>
+              <w:t>.07.2026</w:t>
             </w:r>
           </w:p>
         </w:tc>
@@ -2367,7 +2702,10 @@
               <w:spacing w:after="160"/>
             </w:pPr>
             <w:r>
-              <w:t xml:space="preserve"> </w:t>
+              <w:t xml:space="preserve">Prototype </w:t>
+            </w:r>
+            <w:r>
+              <w:t>2: Architectural Guidance</w:t>
             </w:r>
           </w:p>
         </w:tc>
@@ -2392,8 +2730,616 @@
             <w:pPr>
               <w:spacing w:after="160"/>
             </w:pPr>
+          </w:p>
+        </w:tc>
+      </w:tr>
+      <w:tr>
+        <w:tc>
+          <w:tcPr>
+            <w:tcW w:w="1800" w:type="dxa"/>
+            <w:tcBorders>
+              <w:top w:val="single" w:sz="1" w:space="0" w:color="CCCCCC"/>
+              <w:left w:val="single" w:sz="1" w:space="0" w:color="CCCCCC"/>
+              <w:bottom w:val="single" w:sz="1" w:space="0" w:color="CCCCCC"/>
+              <w:right w:val="single" w:sz="1" w:space="0" w:color="CCCCCC"/>
+            </w:tcBorders>
+            <w:shd w:val="clear" w:color="auto" w:fill="F5F5F5"/>
+            <w:tcMar>
+              <w:top w:w="60" w:type="dxa"/>
+              <w:left w:w="100" w:type="dxa"/>
+              <w:bottom w:w="60" w:type="dxa"/>
+              <w:right w:w="100" w:type="dxa"/>
+            </w:tcMar>
+            <w:vAlign w:val="center"/>
+          </w:tcPr>
+          <w:p>
+            <w:pPr>
+              <w:jc w:val="center"/>
+              <w:rPr>
+                <w:color w:val="666666"/>
+                <w:sz w:val="18"/>
+                <w:szCs w:val="18"/>
+              </w:rPr>
+            </w:pPr>
+            <w:r>
+              <w:rPr>
+                <w:color w:val="666666"/>
+                <w:sz w:val="18"/>
+                <w:szCs w:val="18"/>
+              </w:rPr>
+              <w:t>Week 8</w:t>
+            </w:r>
+          </w:p>
+          <w:p>
+            <w:pPr>
+              <w:jc w:val="center"/>
+            </w:pPr>
+            <w:r>
+              <w:rPr>
+                <w:color w:val="666666"/>
+                <w:sz w:val="18"/>
+                <w:szCs w:val="18"/>
+              </w:rPr>
+              <w:t>27</w:t>
+            </w:r>
+            <w:r>
+              <w:rPr>
+                <w:color w:val="666666"/>
+                <w:sz w:val="18"/>
+                <w:szCs w:val="18"/>
+              </w:rPr>
+              <w:t>.07.2026</w:t>
+            </w:r>
+          </w:p>
+        </w:tc>
+        <w:tc>
+          <w:tcPr>
+            <w:tcW w:w="4919" w:type="dxa"/>
+            <w:tcBorders>
+              <w:top w:val="single" w:sz="1" w:space="0" w:color="CCCCCC"/>
+              <w:left w:val="single" w:sz="1" w:space="0" w:color="CCCCCC"/>
+              <w:bottom w:val="single" w:sz="1" w:space="0" w:color="CCCCCC"/>
+              <w:right w:val="single" w:sz="1" w:space="0" w:color="CCCCCC"/>
+            </w:tcBorders>
+            <w:shd w:val="clear" w:color="auto" w:fill="FFFFFF"/>
+            <w:tcMar>
+              <w:top w:w="60" w:type="dxa"/>
+              <w:left w:w="100" w:type="dxa"/>
+              <w:bottom w:w="60" w:type="dxa"/>
+              <w:right w:w="100" w:type="dxa"/>
+            </w:tcMar>
+          </w:tcPr>
+          <w:p>
+            <w:pPr>
+              <w:spacing w:after="160"/>
+            </w:pPr>
+            <w:r>
+              <w:t xml:space="preserve">Prototype </w:t>
+            </w:r>
+            <w:r>
+              <w:t>3:</w:t>
+            </w:r>
             <w:r>
               <w:t xml:space="preserve"> </w:t>
+            </w:r>
+            <w:r>
+              <w:t xml:space="preserve">Landmark Guidance </w:t>
+            </w:r>
+          </w:p>
+        </w:tc>
+        <w:tc>
+          <w:tcPr>
+            <w:tcW w:w="2919" w:type="dxa"/>
+            <w:tcBorders>
+              <w:top w:val="single" w:sz="1" w:space="0" w:color="CCCCCC"/>
+              <w:left w:val="single" w:sz="1" w:space="0" w:color="CCCCCC"/>
+              <w:bottom w:val="single" w:sz="1" w:space="0" w:color="CCCCCC"/>
+              <w:right w:val="single" w:sz="1" w:space="0" w:color="CCCCCC"/>
+            </w:tcBorders>
+            <w:shd w:val="clear" w:color="auto" w:fill="FFFFFF"/>
+            <w:tcMar>
+              <w:top w:w="60" w:type="dxa"/>
+              <w:left w:w="100" w:type="dxa"/>
+              <w:bottom w:w="60" w:type="dxa"/>
+              <w:right w:w="100" w:type="dxa"/>
+            </w:tcMar>
+          </w:tcPr>
+          <w:p>
+            <w:pPr>
+              <w:spacing w:after="160"/>
+            </w:pPr>
+            <w:r>
+              <w:t xml:space="preserve"> </w:t>
+            </w:r>
+          </w:p>
+        </w:tc>
+      </w:tr>
+      <w:tr>
+        <w:tc>
+          <w:tcPr>
+            <w:tcW w:w="1800" w:type="dxa"/>
+            <w:tcBorders>
+              <w:top w:val="single" w:sz="1" w:space="0" w:color="CCCCCC"/>
+              <w:left w:val="single" w:sz="1" w:space="0" w:color="CCCCCC"/>
+              <w:bottom w:val="single" w:sz="1" w:space="0" w:color="CCCCCC"/>
+              <w:right w:val="single" w:sz="1" w:space="0" w:color="CCCCCC"/>
+            </w:tcBorders>
+            <w:shd w:val="clear" w:color="auto" w:fill="F5F5F5"/>
+            <w:tcMar>
+              <w:top w:w="60" w:type="dxa"/>
+              <w:left w:w="100" w:type="dxa"/>
+              <w:bottom w:w="60" w:type="dxa"/>
+              <w:right w:w="100" w:type="dxa"/>
+            </w:tcMar>
+            <w:vAlign w:val="center"/>
+          </w:tcPr>
+          <w:p>
+            <w:pPr>
+              <w:jc w:val="center"/>
+              <w:rPr>
+                <w:color w:val="666666"/>
+                <w:sz w:val="18"/>
+                <w:szCs w:val="18"/>
+              </w:rPr>
+            </w:pPr>
+            <w:r>
+              <w:rPr>
+                <w:color w:val="666666"/>
+                <w:sz w:val="18"/>
+                <w:szCs w:val="18"/>
+              </w:rPr>
+              <w:t xml:space="preserve">Week </w:t>
+            </w:r>
+            <w:r>
+              <w:rPr>
+                <w:color w:val="666666"/>
+                <w:sz w:val="18"/>
+                <w:szCs w:val="18"/>
+              </w:rPr>
+              <w:t>9</w:t>
+            </w:r>
+          </w:p>
+          <w:p>
+            <w:pPr>
+              <w:jc w:val="center"/>
+              <w:rPr>
+                <w:color w:val="666666"/>
+                <w:sz w:val="18"/>
+                <w:szCs w:val="18"/>
+              </w:rPr>
+            </w:pPr>
+            <w:r>
+              <w:rPr>
+                <w:color w:val="666666"/>
+                <w:sz w:val="18"/>
+                <w:szCs w:val="18"/>
+              </w:rPr>
+              <w:t>3</w:t>
+            </w:r>
+            <w:r>
+              <w:rPr>
+                <w:color w:val="666666"/>
+                <w:sz w:val="18"/>
+                <w:szCs w:val="18"/>
+              </w:rPr>
+              <w:t>.0</w:t>
+            </w:r>
+            <w:r>
+              <w:rPr>
+                <w:color w:val="666666"/>
+                <w:sz w:val="18"/>
+                <w:szCs w:val="18"/>
+              </w:rPr>
+              <w:t>8</w:t>
+            </w:r>
+            <w:r>
+              <w:rPr>
+                <w:color w:val="666666"/>
+                <w:sz w:val="18"/>
+                <w:szCs w:val="18"/>
+              </w:rPr>
+              <w:t>.2026</w:t>
+            </w:r>
+          </w:p>
+        </w:tc>
+        <w:tc>
+          <w:tcPr>
+            <w:tcW w:w="4919" w:type="dxa"/>
+            <w:tcBorders>
+              <w:top w:val="single" w:sz="1" w:space="0" w:color="CCCCCC"/>
+              <w:left w:val="single" w:sz="1" w:space="0" w:color="CCCCCC"/>
+              <w:bottom w:val="single" w:sz="1" w:space="0" w:color="CCCCCC"/>
+              <w:right w:val="single" w:sz="1" w:space="0" w:color="CCCCCC"/>
+            </w:tcBorders>
+            <w:shd w:val="clear" w:color="auto" w:fill="FFFFFF"/>
+            <w:tcMar>
+              <w:top w:w="60" w:type="dxa"/>
+              <w:left w:w="100" w:type="dxa"/>
+              <w:bottom w:w="60" w:type="dxa"/>
+              <w:right w:w="100" w:type="dxa"/>
+            </w:tcMar>
+          </w:tcPr>
+          <w:p>
+            <w:pPr>
+              <w:spacing w:after="160"/>
+            </w:pPr>
+            <w:r>
+              <w:t xml:space="preserve">Prototype </w:t>
+            </w:r>
+            <w:r>
+              <w:t>4: Combined Guidance Techniques</w:t>
+            </w:r>
+          </w:p>
+        </w:tc>
+        <w:tc>
+          <w:tcPr>
+            <w:tcW w:w="2919" w:type="dxa"/>
+            <w:tcBorders>
+              <w:top w:val="single" w:sz="1" w:space="0" w:color="CCCCCC"/>
+              <w:left w:val="single" w:sz="1" w:space="0" w:color="CCCCCC"/>
+              <w:bottom w:val="single" w:sz="1" w:space="0" w:color="CCCCCC"/>
+              <w:right w:val="single" w:sz="1" w:space="0" w:color="CCCCCC"/>
+            </w:tcBorders>
+            <w:shd w:val="clear" w:color="auto" w:fill="FFFFFF"/>
+            <w:tcMar>
+              <w:top w:w="60" w:type="dxa"/>
+              <w:left w:w="100" w:type="dxa"/>
+              <w:bottom w:w="60" w:type="dxa"/>
+              <w:right w:w="100" w:type="dxa"/>
+            </w:tcMar>
+          </w:tcPr>
+          <w:p>
+            <w:pPr>
+              <w:spacing w:after="160"/>
+            </w:pPr>
+          </w:p>
+        </w:tc>
+      </w:tr>
+      <w:tr>
+        <w:tc>
+          <w:tcPr>
+            <w:tcW w:w="1800" w:type="dxa"/>
+            <w:tcBorders>
+              <w:top w:val="single" w:sz="1" w:space="0" w:color="CCCCCC"/>
+              <w:left w:val="single" w:sz="1" w:space="0" w:color="CCCCCC"/>
+              <w:bottom w:val="single" w:sz="1" w:space="0" w:color="CCCCCC"/>
+              <w:right w:val="single" w:sz="1" w:space="0" w:color="CCCCCC"/>
+            </w:tcBorders>
+            <w:shd w:val="clear" w:color="auto" w:fill="F5F5F5"/>
+            <w:tcMar>
+              <w:top w:w="60" w:type="dxa"/>
+              <w:left w:w="100" w:type="dxa"/>
+              <w:bottom w:w="60" w:type="dxa"/>
+              <w:right w:w="100" w:type="dxa"/>
+            </w:tcMar>
+            <w:vAlign w:val="center"/>
+          </w:tcPr>
+          <w:p>
+            <w:pPr>
+              <w:jc w:val="center"/>
+              <w:rPr>
+                <w:color w:val="666666"/>
+                <w:sz w:val="18"/>
+                <w:szCs w:val="18"/>
+              </w:rPr>
+            </w:pPr>
+            <w:r>
+              <w:rPr>
+                <w:color w:val="666666"/>
+                <w:sz w:val="18"/>
+                <w:szCs w:val="18"/>
+              </w:rPr>
+              <w:t>Week 10</w:t>
+            </w:r>
+          </w:p>
+          <w:p>
+            <w:pPr>
+              <w:jc w:val="center"/>
+            </w:pPr>
+            <w:r>
+              <w:rPr>
+                <w:color w:val="666666"/>
+                <w:sz w:val="18"/>
+                <w:szCs w:val="18"/>
+              </w:rPr>
+              <w:t>10</w:t>
+            </w:r>
+            <w:r>
+              <w:rPr>
+                <w:color w:val="666666"/>
+                <w:sz w:val="18"/>
+                <w:szCs w:val="18"/>
+              </w:rPr>
+              <w:t>.08.2026</w:t>
+            </w:r>
+          </w:p>
+        </w:tc>
+        <w:tc>
+          <w:tcPr>
+            <w:tcW w:w="4919" w:type="dxa"/>
+            <w:tcBorders>
+              <w:top w:val="single" w:sz="1" w:space="0" w:color="CCCCCC"/>
+              <w:left w:val="single" w:sz="1" w:space="0" w:color="CCCCCC"/>
+              <w:bottom w:val="single" w:sz="1" w:space="0" w:color="CCCCCC"/>
+              <w:right w:val="single" w:sz="1" w:space="0" w:color="CCCCCC"/>
+            </w:tcBorders>
+            <w:shd w:val="clear" w:color="auto" w:fill="FFFFFF"/>
+            <w:tcMar>
+              <w:top w:w="60" w:type="dxa"/>
+              <w:left w:w="100" w:type="dxa"/>
+              <w:bottom w:w="60" w:type="dxa"/>
+              <w:right w:w="100" w:type="dxa"/>
+            </w:tcMar>
+          </w:tcPr>
+          <w:p>
+            <w:pPr>
+              <w:spacing w:after="160"/>
+            </w:pPr>
+            <w:r>
+              <w:t xml:space="preserve">Conduct user testing sessions and collect participant feedback through observation and questionaries </w:t>
+            </w:r>
+          </w:p>
+        </w:tc>
+        <w:tc>
+          <w:tcPr>
+            <w:tcW w:w="2919" w:type="dxa"/>
+            <w:tcBorders>
+              <w:top w:val="single" w:sz="1" w:space="0" w:color="CCCCCC"/>
+              <w:left w:val="single" w:sz="1" w:space="0" w:color="CCCCCC"/>
+              <w:bottom w:val="single" w:sz="1" w:space="0" w:color="CCCCCC"/>
+              <w:right w:val="single" w:sz="1" w:space="0" w:color="CCCCCC"/>
+            </w:tcBorders>
+            <w:shd w:val="clear" w:color="auto" w:fill="FFFFFF"/>
+            <w:tcMar>
+              <w:top w:w="60" w:type="dxa"/>
+              <w:left w:w="100" w:type="dxa"/>
+              <w:bottom w:w="60" w:type="dxa"/>
+              <w:right w:w="100" w:type="dxa"/>
+            </w:tcMar>
+          </w:tcPr>
+          <w:p>
+            <w:pPr>
+              <w:spacing w:after="160"/>
+            </w:pPr>
+            <w:r>
+              <w:t>Difficulty finding testers, ask classmates, volunteers or online participants</w:t>
+            </w:r>
+          </w:p>
+        </w:tc>
+      </w:tr>
+      <w:tr>
+        <w:tc>
+          <w:tcPr>
+            <w:tcW w:w="1800" w:type="dxa"/>
+            <w:tcBorders>
+              <w:top w:val="single" w:sz="1" w:space="0" w:color="CCCCCC"/>
+              <w:left w:val="single" w:sz="1" w:space="0" w:color="CCCCCC"/>
+              <w:bottom w:val="single" w:sz="1" w:space="0" w:color="CCCCCC"/>
+              <w:right w:val="single" w:sz="1" w:space="0" w:color="CCCCCC"/>
+            </w:tcBorders>
+            <w:shd w:val="clear" w:color="auto" w:fill="F5F5F5"/>
+            <w:tcMar>
+              <w:top w:w="60" w:type="dxa"/>
+              <w:left w:w="100" w:type="dxa"/>
+              <w:bottom w:w="60" w:type="dxa"/>
+              <w:right w:w="100" w:type="dxa"/>
+            </w:tcMar>
+            <w:vAlign w:val="center"/>
+          </w:tcPr>
+          <w:p>
+            <w:pPr>
+              <w:jc w:val="center"/>
+              <w:rPr>
+                <w:color w:val="666666"/>
+                <w:sz w:val="18"/>
+                <w:szCs w:val="18"/>
+              </w:rPr>
+            </w:pPr>
+            <w:r>
+              <w:rPr>
+                <w:color w:val="666666"/>
+                <w:sz w:val="18"/>
+                <w:szCs w:val="18"/>
+              </w:rPr>
+              <w:t xml:space="preserve">Week </w:t>
+            </w:r>
+            <w:r>
+              <w:rPr>
+                <w:color w:val="666666"/>
+                <w:sz w:val="18"/>
+                <w:szCs w:val="18"/>
+              </w:rPr>
+              <w:t>11</w:t>
+            </w:r>
+          </w:p>
+          <w:p>
+            <w:pPr>
+              <w:jc w:val="center"/>
+              <w:rPr>
+                <w:color w:val="666666"/>
+                <w:sz w:val="18"/>
+                <w:szCs w:val="18"/>
+              </w:rPr>
+            </w:pPr>
+            <w:r>
+              <w:rPr>
+                <w:color w:val="666666"/>
+                <w:sz w:val="18"/>
+                <w:szCs w:val="18"/>
+              </w:rPr>
+              <w:t>17</w:t>
+            </w:r>
+            <w:r>
+              <w:rPr>
+                <w:color w:val="666666"/>
+                <w:sz w:val="18"/>
+                <w:szCs w:val="18"/>
+              </w:rPr>
+              <w:t>.08.2026</w:t>
+            </w:r>
+          </w:p>
+        </w:tc>
+        <w:tc>
+          <w:tcPr>
+            <w:tcW w:w="4919" w:type="dxa"/>
+            <w:tcBorders>
+              <w:top w:val="single" w:sz="1" w:space="0" w:color="CCCCCC"/>
+              <w:left w:val="single" w:sz="1" w:space="0" w:color="CCCCCC"/>
+              <w:bottom w:val="single" w:sz="1" w:space="0" w:color="CCCCCC"/>
+              <w:right w:val="single" w:sz="1" w:space="0" w:color="CCCCCC"/>
+            </w:tcBorders>
+            <w:shd w:val="clear" w:color="auto" w:fill="FFFFFF"/>
+            <w:tcMar>
+              <w:top w:w="60" w:type="dxa"/>
+              <w:left w:w="100" w:type="dxa"/>
+              <w:bottom w:w="60" w:type="dxa"/>
+              <w:right w:w="100" w:type="dxa"/>
+            </w:tcMar>
+          </w:tcPr>
+          <w:p>
+            <w:pPr>
+              <w:spacing w:after="160"/>
+            </w:pPr>
+            <w:r>
+              <w:t xml:space="preserve">Continue to conduct user testing, start to analyse findings </w:t>
+            </w:r>
+          </w:p>
+        </w:tc>
+        <w:tc>
+          <w:tcPr>
+            <w:tcW w:w="2919" w:type="dxa"/>
+            <w:tcBorders>
+              <w:top w:val="single" w:sz="1" w:space="0" w:color="CCCCCC"/>
+              <w:left w:val="single" w:sz="1" w:space="0" w:color="CCCCCC"/>
+              <w:bottom w:val="single" w:sz="1" w:space="0" w:color="CCCCCC"/>
+              <w:right w:val="single" w:sz="1" w:space="0" w:color="CCCCCC"/>
+            </w:tcBorders>
+            <w:shd w:val="clear" w:color="auto" w:fill="FFFFFF"/>
+            <w:tcMar>
+              <w:top w:w="60" w:type="dxa"/>
+              <w:left w:w="100" w:type="dxa"/>
+              <w:bottom w:w="60" w:type="dxa"/>
+              <w:right w:w="100" w:type="dxa"/>
+            </w:tcMar>
+          </w:tcPr>
+          <w:p>
+            <w:pPr>
+              <w:spacing w:after="160"/>
+            </w:pPr>
+          </w:p>
+        </w:tc>
+      </w:tr>
+      <w:tr>
+        <w:tc>
+          <w:tcPr>
+            <w:tcW w:w="1800" w:type="dxa"/>
+            <w:tcBorders>
+              <w:top w:val="single" w:sz="1" w:space="0" w:color="CCCCCC"/>
+              <w:left w:val="single" w:sz="1" w:space="0" w:color="CCCCCC"/>
+              <w:bottom w:val="single" w:sz="1" w:space="0" w:color="CCCCCC"/>
+              <w:right w:val="single" w:sz="1" w:space="0" w:color="CCCCCC"/>
+            </w:tcBorders>
+            <w:shd w:val="clear" w:color="auto" w:fill="F5F5F5"/>
+            <w:tcMar>
+              <w:top w:w="60" w:type="dxa"/>
+              <w:left w:w="100" w:type="dxa"/>
+              <w:bottom w:w="60" w:type="dxa"/>
+              <w:right w:w="100" w:type="dxa"/>
+            </w:tcMar>
+            <w:vAlign w:val="center"/>
+          </w:tcPr>
+          <w:p>
+            <w:pPr>
+              <w:jc w:val="center"/>
+              <w:rPr>
+                <w:color w:val="666666"/>
+                <w:sz w:val="18"/>
+                <w:szCs w:val="18"/>
+              </w:rPr>
+            </w:pPr>
+            <w:r>
+              <w:rPr>
+                <w:color w:val="666666"/>
+                <w:sz w:val="18"/>
+                <w:szCs w:val="18"/>
+              </w:rPr>
+              <w:t>Week 12</w:t>
+            </w:r>
+          </w:p>
+          <w:p>
+            <w:pPr>
+              <w:jc w:val="center"/>
+            </w:pPr>
+            <w:r>
+              <w:rPr>
+                <w:color w:val="666666"/>
+                <w:sz w:val="18"/>
+                <w:szCs w:val="18"/>
+              </w:rPr>
+              <w:t>24</w:t>
+            </w:r>
+            <w:r>
+              <w:rPr>
+                <w:color w:val="666666"/>
+                <w:sz w:val="18"/>
+                <w:szCs w:val="18"/>
+              </w:rPr>
+              <w:t>.08.2026</w:t>
+            </w:r>
+          </w:p>
+        </w:tc>
+        <w:tc>
+          <w:tcPr>
+            <w:tcW w:w="4919" w:type="dxa"/>
+            <w:tcBorders>
+              <w:top w:val="single" w:sz="1" w:space="0" w:color="CCCCCC"/>
+              <w:left w:val="single" w:sz="1" w:space="0" w:color="CCCCCC"/>
+              <w:bottom w:val="single" w:sz="1" w:space="0" w:color="CCCCCC"/>
+              <w:right w:val="single" w:sz="1" w:space="0" w:color="CCCCCC"/>
+            </w:tcBorders>
+            <w:shd w:val="clear" w:color="auto" w:fill="FFFFFF"/>
+            <w:tcMar>
+              <w:top w:w="60" w:type="dxa"/>
+              <w:left w:w="100" w:type="dxa"/>
+              <w:bottom w:w="60" w:type="dxa"/>
+              <w:right w:w="100" w:type="dxa"/>
+            </w:tcMar>
+          </w:tcPr>
+          <w:p>
+            <w:pPr>
+              <w:spacing w:after="160"/>
+            </w:pPr>
+            <w:r>
+              <w:t xml:space="preserve">Analyse findings, compare results against literature, complete </w:t>
+            </w:r>
+            <w:r>
+              <w:t>paper?</w:t>
+            </w:r>
+          </w:p>
+        </w:tc>
+        <w:tc>
+          <w:tcPr>
+            <w:tcW w:w="2919" w:type="dxa"/>
+            <w:tcBorders>
+              <w:top w:val="single" w:sz="1" w:space="0" w:color="CCCCCC"/>
+              <w:left w:val="single" w:sz="1" w:space="0" w:color="CCCCCC"/>
+              <w:bottom w:val="single" w:sz="1" w:space="0" w:color="CCCCCC"/>
+              <w:right w:val="single" w:sz="1" w:space="0" w:color="CCCCCC"/>
+            </w:tcBorders>
+            <w:shd w:val="clear" w:color="auto" w:fill="FFFFFF"/>
+            <w:tcMar>
+              <w:top w:w="60" w:type="dxa"/>
+              <w:left w:w="100" w:type="dxa"/>
+              <w:bottom w:w="60" w:type="dxa"/>
+              <w:right w:w="100" w:type="dxa"/>
+            </w:tcMar>
+          </w:tcPr>
+          <w:p>
+            <w:pPr>
+              <w:spacing w:after="160"/>
+            </w:pPr>
+            <w:r>
+              <w:t>Insufficient data or unclear results to report upon</w:t>
             </w:r>
           </w:p>
         </w:tc>
@@ -2487,7 +3433,6 @@
                 <w:sz w:val="18"/>
                 <w:szCs w:val="18"/>
               </w:rPr>
-              <w:lastRenderedPageBreak/>
               <w:t>Proposed method</w:t>
             </w:r>
           </w:p>
@@ -2680,6 +3625,7 @@
               <w:spacing w:after="200"/>
             </w:pPr>
             <w:r>
+              <w:lastRenderedPageBreak/>
               <w:t xml:space="preserve"> </w:t>
             </w:r>
           </w:p>
@@ -2925,12 +3871,12 @@
       </w:pPr>
     </w:p>
     <w:sectPr>
-      <w:headerReference w:type="even" r:id="rId7"/>
-      <w:headerReference w:type="default" r:id="rId8"/>
-      <w:footerReference w:type="even" r:id="rId9"/>
-      <w:footerReference w:type="default" r:id="rId10"/>
-      <w:headerReference w:type="first" r:id="rId11"/>
-      <w:footerReference w:type="first" r:id="rId12"/>
+      <w:headerReference w:type="even" r:id="rId8"/>
+      <w:headerReference w:type="default" r:id="rId9"/>
+      <w:footerReference w:type="even" r:id="rId10"/>
+      <w:footerReference w:type="default" r:id="rId11"/>
+      <w:headerReference w:type="first" r:id="rId12"/>
+      <w:footerReference w:type="first" r:id="rId13"/>
       <w:pgSz w:w="11906" w:h="16838"/>
       <w:pgMar w:top="1634" w:right="1134" w:bottom="1134" w:left="1134" w:header="708" w:footer="708" w:gutter="0"/>
       <w:cols w:space="720"/>
@@ -3947,6 +4893,119 @@
 <file path=word/numbering.xml><?xml version="1.0" encoding="utf-8"?>
 <w:numbering xmlns:wpc="http://schemas.microsoft.com/office/word/2010/wordprocessingCanvas" xmlns:cx="http://schemas.microsoft.com/office/drawing/2014/chartex" xmlns:cx1="http://schemas.microsoft.com/office/drawing/2015/9/8/chartex" xmlns:cx2="http://schemas.microsoft.com/office/drawing/2015/10/21/chartex" xmlns:cx3="http://schemas.microsoft.com/office/drawing/2016/5/9/chartex" xmlns:cx4="http://schemas.microsoft.com/office/drawing/2016/5/10/chartex" xmlns:cx5="http://schemas.microsoft.com/office/drawing/2016/5/11/chartex" xmlns:cx6="http://schemas.microsoft.com/office/drawing/2016/5/12/chartex" xmlns:cx7="http://schemas.microsoft.com/office/drawing/2016/5/13/chartex" xmlns:cx8="http://schemas.microsoft.com/office/drawing/2016/5/14/chartex" xmlns:mc="http://schemas.openxmlformats.org/markup-compatibility/2006" xmlns:aink="http://schemas.microsoft.com/office/drawing/2016/ink" xmlns:am3d="http://schemas.microsoft.com/office/drawing/2017/model3d" xmlns:o="urn:schemas-microsoft-com:office:office" xmlns:oel="http://schemas.microsoft.com/office/2019/extlst" xmlns:r="http://schemas.openxmlformats.org/officeDocument/2006/relationships" xmlns:m="http://schemas.openxmlformats.org/officeDocument/2006/math" xmlns:v="urn:schemas-microsoft-com:vml" xmlns:wp14="http://schemas.microsoft.com/office/word/2010/wordprocessingDrawing" xmlns:wp="http://schemas.openxmlformats.org/drawingml/2006/wordprocessingDrawing" xmlns:w10="urn:schemas-microsoft-com:office:word" xmlns:w="http://schemas.openxmlformats.org/wordprocessingml/2006/main" xmlns:w14="http://schemas.microsoft.com/office/word/2010/wordml" xmlns:w15="http://schemas.microsoft.com/office/word/2012/wordml" xmlns:w16cex="http://schemas.microsoft.com/office/word/2018/wordml/cex" xmlns:w16cid="http://schemas.microsoft.com/office/word/2016/wordml/cid" xmlns:w16="http://schemas.microsoft.com/office/word/2018/wordml" xmlns:w16du="http://schemas.microsoft.com/office/word/2023/wordml/word16du" xmlns:w16sdtdh="http://schemas.microsoft.com/office/word/2020/wordml/sdtdatahash" xmlns:w16sdtfl="http://schemas.microsoft.com/office/word/2024/wordml/sdtformatlock" xmlns:w16se="http://schemas.microsoft.com/office/word/2015/wordml/symex" xmlns:wpg="http://schemas.microsoft.com/office/word/2010/wordprocessingGroup" xmlns:wpi="http://schemas.microsoft.com/office/word/2010/wordprocessingInk" xmlns:wne="http://schemas.microsoft.com/office/word/2006/wordml" xmlns:wps="http://schemas.microsoft.com/office/word/2010/wordprocessingShape" mc:Ignorable="w14 w15 w16se w16cid w16 w16cex w16sdtdh w16sdtfl w16du wp14">
   <w:abstractNum w:abstractNumId="0" w15:restartNumberingAfterBreak="0">
+    <w:nsid w:val="349E4A15"/>
+    <w:multiLevelType w:val="hybridMultilevel"/>
+    <w:tmpl w:val="AAEE19A8"/>
+    <w:lvl w:ilvl="0" w:tplc="08090001">
+      <w:start w:val="1"/>
+      <w:numFmt w:val="bullet"/>
+      <w:lvlText w:val=""/>
+      <w:lvlJc w:val="left"/>
+      <w:pPr>
+        <w:ind w:left="720" w:hanging="360"/>
+      </w:pPr>
+      <w:rPr>
+        <w:rFonts w:ascii="Symbol" w:hAnsi="Symbol" w:hint="default"/>
+      </w:rPr>
+    </w:lvl>
+    <w:lvl w:ilvl="1" w:tplc="08090003" w:tentative="1">
+      <w:start w:val="1"/>
+      <w:numFmt w:val="bullet"/>
+      <w:lvlText w:val="o"/>
+      <w:lvlJc w:val="left"/>
+      <w:pPr>
+        <w:ind w:left="1440" w:hanging="360"/>
+      </w:pPr>
+      <w:rPr>
+        <w:rFonts w:ascii="Courier New" w:hAnsi="Courier New" w:cs="Courier New" w:hint="default"/>
+      </w:rPr>
+    </w:lvl>
+    <w:lvl w:ilvl="2" w:tplc="08090005" w:tentative="1">
+      <w:start w:val="1"/>
+      <w:numFmt w:val="bullet"/>
+      <w:lvlText w:val=""/>
+      <w:lvlJc w:val="left"/>
+      <w:pPr>
+        <w:ind w:left="2160" w:hanging="360"/>
+      </w:pPr>
+      <w:rPr>
+        <w:rFonts w:ascii="Wingdings" w:hAnsi="Wingdings" w:hint="default"/>
+      </w:rPr>
+    </w:lvl>
+    <w:lvl w:ilvl="3" w:tplc="08090001" w:tentative="1">
+      <w:start w:val="1"/>
+      <w:numFmt w:val="bullet"/>
+      <w:lvlText w:val=""/>
+      <w:lvlJc w:val="left"/>
+      <w:pPr>
+        <w:ind w:left="2880" w:hanging="360"/>
+      </w:pPr>
+      <w:rPr>
+        <w:rFonts w:ascii="Symbol" w:hAnsi="Symbol" w:hint="default"/>
+      </w:rPr>
+    </w:lvl>
+    <w:lvl w:ilvl="4" w:tplc="08090003" w:tentative="1">
+      <w:start w:val="1"/>
+      <w:numFmt w:val="bullet"/>
+      <w:lvlText w:val="o"/>
+      <w:lvlJc w:val="left"/>
+      <w:pPr>
+        <w:ind w:left="3600" w:hanging="360"/>
+      </w:pPr>
+      <w:rPr>
+        <w:rFonts w:ascii="Courier New" w:hAnsi="Courier New" w:cs="Courier New" w:hint="default"/>
+      </w:rPr>
+    </w:lvl>
+    <w:lvl w:ilvl="5" w:tplc="08090005" w:tentative="1">
+      <w:start w:val="1"/>
+      <w:numFmt w:val="bullet"/>
+      <w:lvlText w:val=""/>
+      <w:lvlJc w:val="left"/>
+      <w:pPr>
+        <w:ind w:left="4320" w:hanging="360"/>
+      </w:pPr>
+      <w:rPr>
+        <w:rFonts w:ascii="Wingdings" w:hAnsi="Wingdings" w:hint="default"/>
+      </w:rPr>
+    </w:lvl>
+    <w:lvl w:ilvl="6" w:tplc="08090001" w:tentative="1">
+      <w:start w:val="1"/>
+      <w:numFmt w:val="bullet"/>
+      <w:lvlText w:val=""/>
+      <w:lvlJc w:val="left"/>
+      <w:pPr>
+        <w:ind w:left="5040" w:hanging="360"/>
+      </w:pPr>
+      <w:rPr>
+        <w:rFonts w:ascii="Symbol" w:hAnsi="Symbol" w:hint="default"/>
+      </w:rPr>
+    </w:lvl>
+    <w:lvl w:ilvl="7" w:tplc="08090003" w:tentative="1">
+      <w:start w:val="1"/>
+      <w:numFmt w:val="bullet"/>
+      <w:lvlText w:val="o"/>
+      <w:lvlJc w:val="left"/>
+      <w:pPr>
+        <w:ind w:left="5760" w:hanging="360"/>
+      </w:pPr>
+      <w:rPr>
+        <w:rFonts w:ascii="Courier New" w:hAnsi="Courier New" w:cs="Courier New" w:hint="default"/>
+      </w:rPr>
+    </w:lvl>
+    <w:lvl w:ilvl="8" w:tplc="08090005" w:tentative="1">
+      <w:start w:val="1"/>
+      <w:numFmt w:val="bullet"/>
+      <w:lvlText w:val=""/>
+      <w:lvlJc w:val="left"/>
+      <w:pPr>
+        <w:ind w:left="6480" w:hanging="360"/>
+      </w:pPr>
+      <w:rPr>
+        <w:rFonts w:ascii="Wingdings" w:hAnsi="Wingdings" w:hint="default"/>
+      </w:rPr>
+    </w:lvl>
+  </w:abstractNum>
+  <w:abstractNum w:abstractNumId="1" w15:restartNumberingAfterBreak="0">
     <w:nsid w:val="45E360DB"/>
     <w:multiLevelType w:val="hybridMultilevel"/>
     <w:tmpl w:val="FDDED93E"/>
@@ -4033,10 +5092,13 @@
     </w:lvl>
   </w:abstractNum>
   <w:num w:numId="1" w16cid:durableId="1841699987">
-    <w:abstractNumId w:val="0"/>
+    <w:abstractNumId w:val="1"/>
     <w:lvlOverride w:ilvl="0">
       <w:startOverride w:val="1"/>
     </w:lvlOverride>
+  </w:num>
+  <w:num w:numId="2" w16cid:durableId="1824854221">
+    <w:abstractNumId w:val="0"/>
   </w:num>
 </w:numbering>
 </file>
@@ -4672,6 +5734,18 @@
     <w:uiPriority w:val="99"/>
     <w:rsid w:val="00D66322"/>
   </w:style>
+  <w:style w:type="character" w:styleId="UnresolvedMention">
+    <w:name w:val="Unresolved Mention"/>
+    <w:basedOn w:val="DefaultParagraphFont"/>
+    <w:uiPriority w:val="99"/>
+    <w:semiHidden/>
+    <w:unhideWhenUsed/>
+    <w:rsid w:val="00AA4C25"/>
+    <w:rPr>
+      <w:color w:val="605E5C"/>
+      <w:shd w:val="clear" w:color="auto" w:fill="E1DFDD"/>
+    </w:rPr>
+  </w:style>
 </w:styles>
 </file>
 

</xml_diff>